<commit_message>
Update integration spec: real status/score payload, terminal-status firing, per-tenant API key
Bring the spec doc in line with what's now live: the webhook reports the real
status (completed/passed/failed/incomplete) and fires on any terminal result;
the score is a { raw, min, max, percent } object (percent only when the scale
is reported); the reconciliation API returns the same fields plus in-progress
and uses a separate per-tenant API key; and the launch returnUrl is honored on
finish.

Co-Authored-By: Claude Opus 4.8 <noreply@anthropic.com>
Claude-Session: https://claude.ai/code/session_018u9gfGCRwBF7xDumhssY86
</commit_message>
<xml_diff>
--- a/public/downloads/getmatchready-integration.docx
+++ b/public/downloads/getmatchready-integration.docx
@@ -160,7 +160,7 @@
           <w:sz w:val="21"/>
           <w:szCs w:val="21"/>
         </w:rPr>
-        <w:t xml:space="preserve">The moment the referee completes, GetMatchReady sends a signed webhook to an OMS endpoint with the referee ID, module, status, score, timestamps, and certificate ID. OMS records it in RDS and reports to the state. A pull API is also available for reconciliation.</w:t>
+        <w:t xml:space="preserve">The moment the referee reaches a terminal result, GetMatchReady sends a signed webhook to an OMS endpoint with the referee ID, module, status, score, timestamps, and certificate ID. OMS records it in RDS and reports to the state. A pull API is also available for reconciliation.</w:t>
       </w:r>
     </w:p>
     <w:p>
@@ -371,6 +371,18 @@
     </w:p>
     <w:p>
       <w:pPr>
+        <w:spacing w:after="120"/>
+      </w:pPr>
+      <w:r>
+        <w:rPr>
+          <w:sz w:val="21"/>
+          <w:szCs w:val="21"/>
+        </w:rPr>
+        <w:t xml:space="preserve">If the token includes a returnUrl, the referee is sent there automatically when the module finishes.</w:t>
+      </w:r>
+    </w:p>
+    <w:p>
+      <w:pPr>
         <w:pStyle w:val="Heading2"/>
         <w:spacing w:after="100" w:before="260"/>
       </w:pPr>
@@ -392,7 +404,7 @@
           <w:sz w:val="21"/>
           <w:szCs w:val="21"/>
         </w:rPr>
-        <w:t xml:space="preserve">When the module reports complete, GetMatchReady POSTs a signed webhook to the OMS endpoint you provide:</w:t>
+        <w:t xml:space="preserve">When the module reaches a terminal result, GetMatchReady POSTs a signed webhook to the OMS endpoint you provide. It fires on any terminal status — a failed or incomplete attempt is reported too, not only a completion:</w:t>
       </w:r>
     </w:p>
     <w:p>
@@ -467,7 +479,7 @@
           <w:sz w:val="18"/>
           <w:szCs w:val="18"/>
         </w:rPr>
-        <w:t xml:space="preserve">  "event":         "module.completed",</w:t>
+        <w:t xml:space="preserve">  "event":         "module.passed",   // module.completed | passed | failed | incomplete</w:t>
       </w:r>
     </w:p>
     <w:p>
@@ -527,22 +539,22 @@
           <w:sz w:val="18"/>
           <w:szCs w:val="18"/>
         </w:rPr>
-        <w:t xml:space="preserve">  "status":        "completed",</w:t>
-      </w:r>
-    </w:p>
-    <w:p>
-      <w:pPr>
-        <w:shd w:fill="F3F4F6" w:color="auto" w:val="clear"/>
-        <w:spacing w:after="0" w:before="0"/>
-        <w:ind w:left="120" w:right="120"/>
-      </w:pPr>
-      <w:r>
-        <w:rPr>
-          <w:rFonts w:ascii="Consolas" w:cs="Consolas" w:eastAsia="Consolas" w:hAnsi="Consolas"/>
-          <w:sz w:val="18"/>
-          <w:szCs w:val="18"/>
-        </w:rPr>
-        <w:t xml:space="preserve">  "score":         null,</w:t>
+        <w:t xml:space="preserve">  "status":        "passed",           // completed | passed | failed | incomplete</w:t>
+      </w:r>
+    </w:p>
+    <w:p>
+      <w:pPr>
+        <w:shd w:fill="F3F4F6" w:color="auto" w:val="clear"/>
+        <w:spacing w:after="0" w:before="0"/>
+        <w:ind w:left="120" w:right="120"/>
+      </w:pPr>
+      <w:r>
+        <w:rPr>
+          <w:rFonts w:ascii="Consolas" w:cs="Consolas" w:eastAsia="Consolas" w:hAnsi="Consolas"/>
+          <w:sz w:val="18"/>
+          <w:szCs w:val="18"/>
+        </w:rPr>
+        <w:t xml:space="preserve">  "score":         { "raw": 8, "min": 0, "max": 10, "percent": 80 },</w:t>
       </w:r>
     </w:p>
     <w:p>
@@ -587,7 +599,7 @@
           <w:sz w:val="18"/>
           <w:szCs w:val="18"/>
         </w:rPr>
-        <w:t xml:space="preserve">  "certificateId": "OMG-8F3A21",</w:t>
+        <w:t xml:space="preserve">  "certificateId": "OMG-8F3A21",       // null unless the attempt passed</w:t>
       </w:r>
     </w:p>
     <w:p>
@@ -618,6 +630,18 @@
           <w:szCs w:val="18"/>
         </w:rPr>
         <w:t xml:space="preserve">}</w:t>
+      </w:r>
+    </w:p>
+    <w:p>
+      <w:pPr>
+        <w:spacing w:after="120"/>
+      </w:pPr>
+      <w:r>
+        <w:rPr>
+          <w:sz w:val="21"/>
+          <w:szCs w:val="21"/>
+        </w:rPr>
+        <w:t xml:space="preserve">The event name mirrors the status (module.completed, module.passed, module.failed, module.incomplete), so OMS can branch on either field. The score is null when the package reports none; percent is null unless the package reported both a min and a max — the scale is never guessed.</w:t>
       </w:r>
     </w:p>
     <w:p>
@@ -655,7 +679,7 @@
           <w:sz w:val="21"/>
           <w:szCs w:val="21"/>
         </w:rPr>
-        <w:t xml:space="preserve">OMS can also pull status at any time to reconcile its records:</w:t>
+        <w:t xml:space="preserve">OMS can also pull status at any time to reconcile its records. It returns in-progress for a started-but-unfinished module, and carries the same status and score fields as the webhook:</w:t>
       </w:r>
     </w:p>
     <w:p>
@@ -685,7 +709,7 @@
           <w:sz w:val="18"/>
           <w:szCs w:val="18"/>
         </w:rPr>
-        <w:t xml:space="preserve">Authorization: Bearer &lt;API key&gt;</w:t>
+        <w:t xml:space="preserve">Authorization: Bearer &lt;API key&gt;   // per-tenant key, separate from the signing secret</w:t>
       </w:r>
     </w:p>
     <w:p>
@@ -715,7 +739,37 @@
           <w:sz w:val="18"/>
           <w:szCs w:val="18"/>
         </w:rPr>
-        <w:t xml:space="preserve">→ [ { "moduleId": "ussf-recert-2026", "status": "completed",</w:t>
+        <w:t xml:space="preserve">→ [ { "moduleId": "ussf-recert-2026",</w:t>
+      </w:r>
+    </w:p>
+    <w:p>
+      <w:pPr>
+        <w:shd w:fill="F3F4F6" w:color="auto" w:val="clear"/>
+        <w:spacing w:after="0" w:before="0"/>
+        <w:ind w:left="120" w:right="120"/>
+      </w:pPr>
+      <w:r>
+        <w:rPr>
+          <w:rFonts w:ascii="Consolas" w:cs="Consolas" w:eastAsia="Consolas" w:hAnsi="Consolas"/>
+          <w:sz w:val="18"/>
+          <w:szCs w:val="18"/>
+        </w:rPr>
+        <w:t xml:space="preserve">      "status": "passed",          // completed | passed | failed | incomplete | in-progress</w:t>
+      </w:r>
+    </w:p>
+    <w:p>
+      <w:pPr>
+        <w:shd w:fill="F3F4F6" w:color="auto" w:val="clear"/>
+        <w:spacing w:after="0" w:before="0"/>
+        <w:ind w:left="120" w:right="120"/>
+      </w:pPr>
+      <w:r>
+        <w:rPr>
+          <w:rFonts w:ascii="Consolas" w:cs="Consolas" w:eastAsia="Consolas" w:hAnsi="Consolas"/>
+          <w:sz w:val="18"/>
+          <w:szCs w:val="18"/>
+        </w:rPr>
+        <w:t xml:space="preserve">      "score": { "raw": 8, "min": 0, "max": 10, "percent": 80 },</w:t>
       </w:r>
     </w:p>
     <w:p>
@@ -811,6 +865,23 @@
           <w:szCs w:val="21"/>
         </w:rPr>
         <w:t xml:space="preserve">SCORM packages are served over HTTPS, same-origin, which makes completion tracking tamper-resistant: a “complete” reflects that the referee actually finished.</w:t>
+      </w:r>
+    </w:p>
+    <w:p>
+      <w:pPr>
+        <w:pStyle w:val="ListParagraph"/>
+        <w:numPr>
+          <w:ilvl w:val="0"/>
+          <w:numId w:val="1"/>
+        </w:numPr>
+        <w:spacing w:after="60"/>
+      </w:pPr>
+      <w:r>
+        <w:rPr>
+          <w:sz w:val="21"/>
+          <w:szCs w:val="21"/>
+        </w:rPr>
+        <w:t xml:space="preserve">The reconciliation API uses a separate, per-tenant API key — distinct from the signing secret — so pulling status and signing tokens are controlled independently.</w:t>
       </w:r>
     </w:p>
     <w:p>

</xml_diff>

<commit_message>
Spec: mark org and returnUrl launch claims as optional
Small clarity tweak so the doc matches the wording used with the partner —
the org and returnUrl claims are optional.

Co-Authored-By: Claude Opus 4.8 <noreply@anthropic.com>
Claude-Session: https://claude.ai/code/session_018u9gfGCRwBF7xDumhssY86
</commit_message>
<xml_diff>
--- a/public/downloads/getmatchready-integration.docx
+++ b/public/downloads/getmatchready-integration.docx
@@ -321,22 +321,22 @@
           <w:sz w:val="18"/>
           <w:szCs w:val="18"/>
         </w:rPr>
-        <w:t xml:space="preserve">  "org":       "NC",                 // state association</w:t>
-      </w:r>
-    </w:p>
-    <w:p>
-      <w:pPr>
-        <w:shd w:fill="F3F4F6" w:color="auto" w:val="clear"/>
-        <w:spacing w:after="0" w:before="0"/>
-        <w:ind w:left="120" w:right="120"/>
-      </w:pPr>
-      <w:r>
-        <w:rPr>
-          <w:rFonts w:ascii="Consolas" w:cs="Consolas" w:eastAsia="Consolas" w:hAnsi="Consolas"/>
-          <w:sz w:val="18"/>
-          <w:szCs w:val="18"/>
-        </w:rPr>
-        <w:t xml:space="preserve">  "returnUrl": "https://oms.example.com/refs/482913/training",</w:t>
+        <w:t xml:space="preserve">  "org":       "NC",                 // state association (optional)</w:t>
+      </w:r>
+    </w:p>
+    <w:p>
+      <w:pPr>
+        <w:shd w:fill="F3F4F6" w:color="auto" w:val="clear"/>
+        <w:spacing w:after="0" w:before="0"/>
+        <w:ind w:left="120" w:right="120"/>
+      </w:pPr>
+      <w:r>
+        <w:rPr>
+          <w:rFonts w:ascii="Consolas" w:cs="Consolas" w:eastAsia="Consolas" w:hAnsi="Consolas"/>
+          <w:sz w:val="18"/>
+          <w:szCs w:val="18"/>
+        </w:rPr>
+        <w:t xml:space="preserve">  "returnUrl": "https://oms.example.com/refs/482913/training",  // optional</w:t>
       </w:r>
     </w:p>
     <w:p>

</xml_diff>